<commit_message>
Protect employer confidentiality and refocus public work
</commit_message>
<xml_diff>
--- a/Himanshu_Gupta_AI_Resume_5plus_Years.docx
+++ b/Himanshu_Gupta_AI_Resume_5plus_Years.docx
@@ -4,271 +4,570 @@
   <w:body>
     <w:p>
       <w:pPr>
-        <w:pStyle w:val="Heading1"/>
+        <w:spacing w:after="0"/>
       </w:pPr>
       <w:r>
+        <w:rPr>
+          <w:rFonts w:ascii="Aptos" w:hAnsi="Aptos"/>
+          <w:b/>
+          <w:i w:val="0"/>
+          <w:color w:val="181916"/>
+          <w:sz w:val="46"/>
+        </w:rPr>
         <w:t>Himanshu Gupta</w:t>
       </w:r>
     </w:p>
     <w:p>
+      <w:pPr>
+        <w:spacing w:after="40"/>
+      </w:pPr>
       <w:r>
         <w:rPr>
+          <w:rFonts w:ascii="Aptos" w:hAnsi="Aptos"/>
           <w:b/>
+          <w:i w:val="0"/>
+          <w:color w:val="D63E23"/>
+          <w:sz w:val="21"/>
         </w:rPr>
-        <w:t>Python Backend &amp; AI Engineer</w:t>
-        <w:br/>
-      </w:r>
-      <w:r>
-        <w:t>Python | Django | Flask | AI/LLMs | RAG | PostgreSQL | REST APIs | Git | Linux</w:t>
+        <w:t>PYTHON BACKEND &amp; PRODUCT ENGINEER</w:t>
       </w:r>
     </w:p>
     <w:p>
       <w:pPr>
-        <w:pStyle w:val="Heading2"/>
+        <w:spacing w:after="60"/>
       </w:pPr>
       <w:r>
-        <w:t>Professional Summary</w:t>
-      </w:r>
-    </w:p>
-    <w:p>
-      <w:r>
-        <w:t>Software Engineer with 5+ years of experience building scalable backend applications using Python, Django, and Flask. Experienced in AI-powered financial research systems, LLM integration, Retrieval-Augmented Generation (RAG), prompt engineering, vector search, and production-ready APIs. Strong background in designing data pipelines, financial document analysis, and intelligent stock-screening solutions.</w:t>
+        <w:rPr>
+          <w:rFonts w:ascii="Aptos" w:hAnsi="Aptos"/>
+          <w:b w:val="0"/>
+          <w:i w:val="0"/>
+          <w:color w:val="53544F"/>
+          <w:sz w:val="17"/>
+        </w:rPr>
+        <w:t>Python · Django · Flask · REST APIs · PostgreSQL · Automation · Applied AI</w:t>
       </w:r>
     </w:p>
     <w:p>
       <w:pPr>
-        <w:pStyle w:val="Heading2"/>
+        <w:spacing w:after="100"/>
+        <w:pBdr>
+          <w:bottom w:val="single" w:sz="10" w:space="5" w:color="24251F"/>
+        </w:pBdr>
       </w:pPr>
       <w:r>
-        <w:t>Professional Experience</w:t>
+        <w:rPr>
+          <w:rFonts w:ascii="Aptos" w:hAnsi="Aptos"/>
+          <w:b w:val="0"/>
+          <w:i w:val="0"/>
+          <w:color w:val="181916"/>
+          <w:sz w:val="17"/>
+        </w:rPr>
+        <w:t>Lucknow, India  ·  imhimansu28@gmail.com  ·  github.com/imhimansu28</w:t>
       </w:r>
     </w:p>
     <w:p>
+      <w:pPr>
+        <w:spacing w:before="140" w:after="60"/>
+        <w:pBdr>
+          <w:bottom w:val="single" w:sz="6" w:space="5" w:color="D9D6CE"/>
+        </w:pBdr>
+      </w:pPr>
       <w:r>
         <w:rPr>
+          <w:rFonts w:ascii="Aptos" w:hAnsi="Aptos"/>
           <w:b/>
+          <w:i w:val="0"/>
+          <w:color w:val="D63E23"/>
+          <w:sz w:val="21"/>
         </w:rPr>
-        <w:t>Software Engineer – Global-Web Development (Aug 2021 – Present)</w:t>
+        <w:t>PROFESSIONAL SUMMARY</w:t>
+      </w:r>
+    </w:p>
+    <w:p>
+      <w:pPr>
+        <w:spacing w:after="40"/>
+      </w:pPr>
+      <w:r>
+        <w:rPr>
+          <w:rFonts w:ascii="Aptos" w:hAnsi="Aptos"/>
+          <w:b w:val="0"/>
+          <w:i w:val="0"/>
+          <w:color w:val="181916"/>
+          <w:sz w:val="18"/>
+        </w:rPr>
+        <w:t>Software engineer at Screener with 5+ years of experience building dependable web software with Python, Django, Flask, JavaScript, and relational databases. Strong in backend services, API design, data modeling, automation, product delivery, and practical AI integration. This public résumé intentionally excludes employer product features, internal architecture, company data, workflows, and metrics.</w:t>
+      </w:r>
+    </w:p>
+    <w:p>
+      <w:pPr>
+        <w:spacing w:before="140" w:after="60"/>
+        <w:pBdr>
+          <w:bottom w:val="single" w:sz="6" w:space="5" w:color="D9D6CE"/>
+        </w:pBdr>
+      </w:pPr>
+      <w:r>
+        <w:rPr>
+          <w:rFonts w:ascii="Aptos" w:hAnsi="Aptos"/>
+          <w:b/>
+          <w:i w:val="0"/>
+          <w:color w:val="D63E23"/>
+          <w:sz w:val="21"/>
+        </w:rPr>
+        <w:t>PROFESSIONAL EXPERIENCE</w:t>
+      </w:r>
+    </w:p>
+    <w:p>
+      <w:pPr>
+        <w:spacing w:after="20"/>
+      </w:pPr>
+      <w:r>
+        <w:rPr>
+          <w:rFonts w:ascii="Aptos" w:hAnsi="Aptos"/>
+          <w:b/>
+          <w:i w:val="0"/>
+          <w:color w:val="181916"/>
+          <w:sz w:val="20"/>
+        </w:rPr>
+        <w:t>Software Engineer — Screener</w:t>
+      </w:r>
+      <w:r>
+        <w:rPr>
+          <w:rFonts w:ascii="Aptos" w:hAnsi="Aptos"/>
+          <w:b/>
+          <w:i w:val="0"/>
+          <w:color w:val="D63E23"/>
+          <w:sz w:val="16"/>
+        </w:rPr>
+        <w:t xml:space="preserve">  ·  Current</w:t>
       </w:r>
     </w:p>
     <w:p>
       <w:pPr>
         <w:pStyle w:val="ListBullet"/>
+        <w:spacing w:after="30"/>
+        <w:ind w:left="259" w:hanging="202"/>
       </w:pPr>
       <w:r>
-        <w:t>Developed and maintained scalable web applications using Python, Django, Flask, JavaScript, and PostgreSQL.</w:t>
+        <w:t>Current software engineering role; employer work remains confidential.</w:t>
       </w:r>
     </w:p>
     <w:p>
       <w:pPr>
         <w:pStyle w:val="ListBullet"/>
+        <w:spacing w:after="30"/>
+        <w:ind w:left="259" w:hanging="202"/>
       </w:pPr>
       <w:r>
-        <w:t>Designed REST APIs and backend services for production applications.</w:t>
+        <w:t>This public résumé includes no employer product details, feature flows, architecture, data, workflows, or metrics.</w:t>
       </w:r>
     </w:p>
     <w:p>
       <w:pPr>
         <w:pStyle w:val="ListBullet"/>
+        <w:spacing w:after="30"/>
+        <w:ind w:left="259" w:hanging="202"/>
       </w:pPr>
       <w:r>
-        <w:t>Built AI-powered financial screening and research workflows using Large Language Models (LLMs).</w:t>
+        <w:t>Inspectable evidence of my engineering skills appears in the public projects below.</w:t>
+      </w:r>
+    </w:p>
+    <w:p>
+      <w:pPr>
+        <w:spacing w:before="60" w:after="20"/>
+      </w:pPr>
+      <w:r>
+        <w:rPr>
+          <w:rFonts w:ascii="Aptos" w:hAnsi="Aptos"/>
+          <w:b/>
+          <w:i w:val="0"/>
+          <w:color w:val="181916"/>
+          <w:sz w:val="20"/>
+        </w:rPr>
+        <w:t>Python / Django Intern — Scimox</w:t>
+      </w:r>
+      <w:r>
+        <w:rPr>
+          <w:rFonts w:ascii="Aptos" w:hAnsi="Aptos"/>
+          <w:b/>
+          <w:i w:val="0"/>
+          <w:color w:val="53544F"/>
+          <w:sz w:val="16"/>
+        </w:rPr>
+        <w:t xml:space="preserve">  ·  2020–2021</w:t>
       </w:r>
     </w:p>
     <w:p>
       <w:pPr>
         <w:pStyle w:val="ListBullet"/>
+        <w:spacing w:after="30"/>
+        <w:ind w:left="259" w:hanging="202"/>
       </w:pPr>
       <w:r>
-        <w:t>Implemented Retrieval-Augmented Generation (RAG) pipelines for annual reports, earnings calls, and investor presentations.</w:t>
+        <w:rPr>
+          <w:rFonts w:ascii="Aptos" w:hAnsi="Aptos"/>
+          <w:b w:val="0"/>
+          <w:i w:val="0"/>
+          <w:color w:val="181916"/>
+          <w:sz w:val="18"/>
+        </w:rPr>
+        <w:t>Shipped Django and Flask applications covering CRUD workflows, user authentication, database integration, and responsive interfaces.</w:t>
+      </w:r>
+    </w:p>
+    <w:p>
+      <w:pPr>
+        <w:spacing w:before="140" w:after="60"/>
+        <w:pBdr>
+          <w:bottom w:val="single" w:sz="6" w:space="5" w:color="D9D6CE"/>
+        </w:pBdr>
+      </w:pPr>
+      <w:r>
+        <w:rPr>
+          <w:rFonts w:ascii="Aptos" w:hAnsi="Aptos"/>
+          <w:b/>
+          <w:i w:val="0"/>
+          <w:color w:val="D63E23"/>
+          <w:sz w:val="21"/>
+        </w:rPr>
+        <w:t>TECHNICAL SKILLS</w:t>
+      </w:r>
+    </w:p>
+    <w:p>
+      <w:pPr>
+        <w:spacing w:after="20"/>
+      </w:pPr>
+      <w:r>
+        <w:rPr>
+          <w:rFonts w:ascii="Aptos" w:hAnsi="Aptos"/>
+          <w:b/>
+          <w:i w:val="0"/>
+          <w:color w:val="181916"/>
+          <w:sz w:val="17"/>
+        </w:rPr>
+        <w:t xml:space="preserve">Languages: </w:t>
+      </w:r>
+      <w:r>
+        <w:rPr>
+          <w:rFonts w:ascii="Aptos" w:hAnsi="Aptos"/>
+          <w:b w:val="0"/>
+          <w:i w:val="0"/>
+          <w:color w:val="181916"/>
+          <w:sz w:val="17"/>
+        </w:rPr>
+        <w:t>Python, JavaScript, SQL</w:t>
+      </w:r>
+    </w:p>
+    <w:p>
+      <w:pPr>
+        <w:spacing w:after="20"/>
+      </w:pPr>
+      <w:r>
+        <w:rPr>
+          <w:rFonts w:ascii="Aptos" w:hAnsi="Aptos"/>
+          <w:b/>
+          <w:i w:val="0"/>
+          <w:color w:val="181916"/>
+          <w:sz w:val="17"/>
+        </w:rPr>
+        <w:t xml:space="preserve">Frameworks: </w:t>
+      </w:r>
+      <w:r>
+        <w:rPr>
+          <w:rFonts w:ascii="Aptos" w:hAnsi="Aptos"/>
+          <w:b w:val="0"/>
+          <w:i w:val="0"/>
+          <w:color w:val="181916"/>
+          <w:sz w:val="17"/>
+        </w:rPr>
+        <w:t>Django, Flask, Alpine.js</w:t>
+      </w:r>
+    </w:p>
+    <w:p>
+      <w:pPr>
+        <w:spacing w:after="20"/>
+      </w:pPr>
+      <w:r>
+        <w:rPr>
+          <w:rFonts w:ascii="Aptos" w:hAnsi="Aptos"/>
+          <w:b/>
+          <w:i w:val="0"/>
+          <w:color w:val="181916"/>
+          <w:sz w:val="17"/>
+        </w:rPr>
+        <w:t xml:space="preserve">Backend: </w:t>
+      </w:r>
+      <w:r>
+        <w:rPr>
+          <w:rFonts w:ascii="Aptos" w:hAnsi="Aptos"/>
+          <w:b w:val="0"/>
+          <w:i w:val="0"/>
+          <w:color w:val="181916"/>
+          <w:sz w:val="17"/>
+        </w:rPr>
+        <w:t>REST APIs, authentication, business logic, integrations, automation, testing</w:t>
+      </w:r>
+    </w:p>
+    <w:p>
+      <w:pPr>
+        <w:spacing w:after="20"/>
+      </w:pPr>
+      <w:r>
+        <w:rPr>
+          <w:rFonts w:ascii="Aptos" w:hAnsi="Aptos"/>
+          <w:b/>
+          <w:i w:val="0"/>
+          <w:color w:val="181916"/>
+          <w:sz w:val="17"/>
+        </w:rPr>
+        <w:t xml:space="preserve">Data: </w:t>
+      </w:r>
+      <w:r>
+        <w:rPr>
+          <w:rFonts w:ascii="Aptos" w:hAnsi="Aptos"/>
+          <w:b w:val="0"/>
+          <w:i w:val="0"/>
+          <w:color w:val="181916"/>
+          <w:sz w:val="17"/>
+        </w:rPr>
+        <w:t>PostgreSQL, SQLite, relational modeling, query design</w:t>
+      </w:r>
+    </w:p>
+    <w:p>
+      <w:pPr>
+        <w:spacing w:after="20"/>
+      </w:pPr>
+      <w:r>
+        <w:rPr>
+          <w:rFonts w:ascii="Aptos" w:hAnsi="Aptos"/>
+          <w:b/>
+          <w:i w:val="0"/>
+          <w:color w:val="181916"/>
+          <w:sz w:val="17"/>
+        </w:rPr>
+        <w:t xml:space="preserve">Applied AI: </w:t>
+      </w:r>
+      <w:r>
+        <w:rPr>
+          <w:rFonts w:ascii="Aptos" w:hAnsi="Aptos"/>
+          <w:b w:val="0"/>
+          <w:i w:val="0"/>
+          <w:color w:val="181916"/>
+          <w:sz w:val="17"/>
+        </w:rPr>
+        <w:t>LLM API integration, prompt design, workflow automation</w:t>
+      </w:r>
+    </w:p>
+    <w:p>
+      <w:pPr>
+        <w:spacing w:after="20"/>
+      </w:pPr>
+      <w:r>
+        <w:rPr>
+          <w:rFonts w:ascii="Aptos" w:hAnsi="Aptos"/>
+          <w:b/>
+          <w:i w:val="0"/>
+          <w:color w:val="181916"/>
+          <w:sz w:val="17"/>
+        </w:rPr>
+        <w:t xml:space="preserve">Tools: </w:t>
+      </w:r>
+      <w:r>
+        <w:rPr>
+          <w:rFonts w:ascii="Aptos" w:hAnsi="Aptos"/>
+          <w:b w:val="0"/>
+          <w:i w:val="0"/>
+          <w:color w:val="181916"/>
+          <w:sz w:val="17"/>
+        </w:rPr>
+        <w:t>Git, GitHub, Linux, Docker (basic)</w:t>
+      </w:r>
+    </w:p>
+    <w:p>
+      <w:pPr>
+        <w:spacing w:before="140" w:after="60"/>
+        <w:pBdr>
+          <w:bottom w:val="single" w:sz="6" w:space="5" w:color="D9D6CE"/>
+        </w:pBdr>
+      </w:pPr>
+      <w:r>
+        <w:rPr>
+          <w:rFonts w:ascii="Aptos" w:hAnsi="Aptos"/>
+          <w:b/>
+          <w:i w:val="0"/>
+          <w:color w:val="D63E23"/>
+          <w:sz w:val="21"/>
+        </w:rPr>
+        <w:t>PUBLIC PROJECTS</w:t>
       </w:r>
     </w:p>
     <w:p>
       <w:pPr>
         <w:pStyle w:val="ListBullet"/>
+        <w:spacing w:after="28"/>
+        <w:ind w:left="259" w:hanging="202"/>
       </w:pPr>
       <w:r>
-        <w:t>Automated extraction of financial KPIs, operational metrics, and business insights from company filings.</w:t>
+        <w:rPr>
+          <w:rFonts w:ascii="Aptos" w:hAnsi="Aptos"/>
+          <w:b/>
+          <w:i w:val="0"/>
+          <w:color w:val="181916"/>
+          <w:sz w:val="17"/>
+        </w:rPr>
+        <w:t xml:space="preserve">Bookmark Manager: </w:t>
+      </w:r>
+      <w:r>
+        <w:rPr>
+          <w:rFonts w:ascii="Aptos" w:hAnsi="Aptos"/>
+          <w:b w:val="0"/>
+          <w:i w:val="0"/>
+          <w:color w:val="181916"/>
+          <w:sz w:val="17"/>
+        </w:rPr>
+        <w:t>Django application for importing browser bookmark JSON into user-owned, paginated libraries.</w:t>
       </w:r>
     </w:p>
     <w:p>
       <w:pPr>
         <w:pStyle w:val="ListBullet"/>
+        <w:spacing w:after="28"/>
+        <w:ind w:left="259" w:hanging="202"/>
       </w:pPr>
       <w:r>
-        <w:t>Worked with embeddings and vector databases to improve semantic search over financial documents.</w:t>
+        <w:rPr>
+          <w:rFonts w:ascii="Aptos" w:hAnsi="Aptos"/>
+          <w:b/>
+          <w:i w:val="0"/>
+          <w:color w:val="181916"/>
+          <w:sz w:val="17"/>
+        </w:rPr>
+        <w:t xml:space="preserve">Django OnlineShop: </w:t>
+      </w:r>
+      <w:r>
+        <w:rPr>
+          <w:rFonts w:ascii="Aptos" w:hAnsi="Aptos"/>
+          <w:b w:val="0"/>
+          <w:i w:val="0"/>
+          <w:color w:val="181916"/>
+          <w:sz w:val="17"/>
+        </w:rPr>
+        <w:t>E-commerce application covering catalog, cart, checkout, orders, reviews, and administration.</w:t>
       </w:r>
     </w:p>
     <w:p>
       <w:pPr>
         <w:pStyle w:val="ListBullet"/>
+        <w:spacing w:after="28"/>
+        <w:ind w:left="259" w:hanging="202"/>
       </w:pPr>
       <w:r>
-        <w:t>Optimized AI pipelines for performance, reliability, and cost.</w:t>
+        <w:rPr>
+          <w:rFonts w:ascii="Aptos" w:hAnsi="Aptos"/>
+          <w:b/>
+          <w:i w:val="0"/>
+          <w:color w:val="181916"/>
+          <w:sz w:val="17"/>
+        </w:rPr>
+        <w:t xml:space="preserve">Vim Mastery: </w:t>
       </w:r>
-    </w:p>
-    <w:p>
       <w:r>
         <w:rPr>
-          <w:b/>
+          <w:rFonts w:ascii="Aptos" w:hAnsi="Aptos"/>
+          <w:b w:val="0"/>
+          <w:i w:val="0"/>
+          <w:color w:val="181916"/>
+          <w:sz w:val="17"/>
         </w:rPr>
-        <w:t>Python/Django Intern – Scimox (2020–2021)</w:t>
+        <w:t>Interactive JavaScript learning application with challenges, editor practice, flashcards, and saved progress.</w:t>
       </w:r>
     </w:p>
     <w:p>
       <w:pPr>
         <w:pStyle w:val="ListBullet"/>
+        <w:spacing w:after="28"/>
+        <w:ind w:left="259" w:hanging="202"/>
       </w:pPr>
       <w:r>
-        <w:t>Built Django and Flask applications, implemented CRUD modules, authentication, database integration, and responsive user interfaces.</w:t>
+        <w:rPr>
+          <w:rFonts w:ascii="Aptos" w:hAnsi="Aptos"/>
+          <w:b/>
+          <w:i w:val="0"/>
+          <w:color w:val="181916"/>
+          <w:sz w:val="17"/>
+        </w:rPr>
+        <w:t xml:space="preserve">Wikipedia Search: </w:t>
+      </w:r>
+      <w:r>
+        <w:rPr>
+          <w:rFonts w:ascii="Aptos" w:hAnsi="Aptos"/>
+          <w:b w:val="0"/>
+          <w:i w:val="0"/>
+          <w:color w:val="181916"/>
+          <w:sz w:val="17"/>
+        </w:rPr>
+        <w:t>Alpine.js search interface with asynchronous API requests and keyboard-friendly interaction.</w:t>
       </w:r>
     </w:p>
     <w:p>
       <w:pPr>
-        <w:pStyle w:val="Heading2"/>
+        <w:spacing w:before="140" w:after="60"/>
+        <w:pBdr>
+          <w:bottom w:val="single" w:sz="6" w:space="5" w:color="D9D6CE"/>
+        </w:pBdr>
       </w:pPr>
       <w:r>
-        <w:t>Technical Skills</w:t>
+        <w:rPr>
+          <w:rFonts w:ascii="Aptos" w:hAnsi="Aptos"/>
+          <w:b/>
+          <w:i w:val="0"/>
+          <w:color w:val="D63E23"/>
+          <w:sz w:val="21"/>
+        </w:rPr>
+        <w:t>EDUCATION &amp; CERTIFICATIONS</w:t>
       </w:r>
     </w:p>
     <w:p>
       <w:pPr>
-        <w:pStyle w:val="ListBullet"/>
+        <w:spacing w:after="20"/>
       </w:pPr>
       <w:r>
-        <w:t>Languages: Python, JavaScript</w:t>
+        <w:rPr>
+          <w:rFonts w:ascii="Aptos" w:hAnsi="Aptos"/>
+          <w:b/>
+          <w:i w:val="0"/>
+          <w:color w:val="181916"/>
+          <w:sz w:val="18"/>
+        </w:rPr>
+        <w:t>Diploma in Computer Science &amp; Engineering</w:t>
+      </w:r>
+      <w:r>
+        <w:rPr>
+          <w:rFonts w:ascii="Aptos" w:hAnsi="Aptos"/>
+          <w:b w:val="0"/>
+          <w:i w:val="0"/>
+          <w:color w:val="181916"/>
+          <w:sz w:val="18"/>
+        </w:rPr>
+        <w:t xml:space="preserve"> — Government Polytechnic, Unnao (2016–2019)</w:t>
       </w:r>
     </w:p>
     <w:p>
       <w:pPr>
-        <w:pStyle w:val="ListBullet"/>
+        <w:spacing w:after="0"/>
       </w:pPr>
       <w:r>
-        <w:t>Frameworks: Django, Flask</w:t>
-      </w:r>
-    </w:p>
-    <w:p>
-      <w:pPr>
-        <w:pStyle w:val="ListBullet"/>
-      </w:pPr>
-      <w:r>
-        <w:t>AI: OpenAI API, Prompt Engineering, RAG, Embeddings, Vector Databases</w:t>
-      </w:r>
-    </w:p>
-    <w:p>
-      <w:pPr>
-        <w:pStyle w:val="ListBullet"/>
-      </w:pPr>
-      <w:r>
-        <w:t>Databases: PostgreSQL, SQLite</w:t>
-      </w:r>
-    </w:p>
-    <w:p>
-      <w:pPr>
-        <w:pStyle w:val="ListBullet"/>
-      </w:pPr>
-      <w:r>
-        <w:t>Web: HTML, CSS, Bootstrap</w:t>
-      </w:r>
-    </w:p>
-    <w:p>
-      <w:pPr>
-        <w:pStyle w:val="ListBullet"/>
-      </w:pPr>
-      <w:r>
-        <w:t>Tools: Git, GitHub, Linux, Docker (Basic)</w:t>
-      </w:r>
-    </w:p>
-    <w:p>
-      <w:pPr>
-        <w:pStyle w:val="Heading2"/>
-      </w:pPr>
-      <w:r>
-        <w:t>Projects</w:t>
-      </w:r>
-    </w:p>
-    <w:p>
-      <w:r>
         <w:rPr>
-          <w:b/>
+          <w:rFonts w:ascii="Aptos" w:hAnsi="Aptos"/>
+          <w:b w:val="0"/>
+          <w:i w:val="0"/>
+          <w:color w:val="53544F"/>
+          <w:sz w:val="17"/>
         </w:rPr>
-        <w:t>AI-Powered Financial Screening Platform</w:t>
-      </w:r>
-    </w:p>
-    <w:p>
-      <w:pPr>
-        <w:pStyle w:val="ListBullet"/>
-      </w:pPr>
-      <w:r>
-        <w:t>Developed AI workflows to analyze annual reports, quarterly results, earnings call transcripts, and generate investment insights using LLMs.</w:t>
-      </w:r>
-    </w:p>
-    <w:p>
-      <w:r>
-        <w:rPr>
-          <w:b/>
-        </w:rPr>
-        <w:t>Real Estate Management System</w:t>
-      </w:r>
-    </w:p>
-    <w:p>
-      <w:pPr>
-        <w:pStyle w:val="ListBullet"/>
-      </w:pPr>
-      <w:r>
-        <w:t>Built a property management platform with Django and PostgreSQL.</w:t>
-      </w:r>
-    </w:p>
-    <w:p>
-      <w:r>
-        <w:rPr>
-          <w:b/>
-        </w:rPr>
-        <w:t>E-Commerce Portal</w:t>
-      </w:r>
-    </w:p>
-    <w:p>
-      <w:pPr>
-        <w:pStyle w:val="ListBullet"/>
-      </w:pPr>
-      <w:r>
-        <w:t>Developed an online shopping platform with product, order, and user management.</w:t>
-      </w:r>
-    </w:p>
-    <w:p>
-      <w:pPr>
-        <w:pStyle w:val="Heading2"/>
-      </w:pPr>
-      <w:r>
-        <w:t>Education</w:t>
-      </w:r>
-    </w:p>
-    <w:p>
-      <w:r>
-        <w:t>Diploma in Computer Science &amp; Engineering – Government Polytechnic, Unnao (2016–2019)</w:t>
-      </w:r>
-    </w:p>
-    <w:p>
-      <w:pPr>
-        <w:pStyle w:val="Heading2"/>
-      </w:pPr>
-      <w:r>
-        <w:t>Certifications</w:t>
-      </w:r>
-    </w:p>
-    <w:p>
-      <w:pPr>
-        <w:pStyle w:val="ListBullet"/>
-      </w:pPr>
-      <w:r>
-        <w:t>• NPTEL – Data Structures and Algorithms Using Python</w:t>
-        <w:br/>
-        <w:t>• HackerRank – Problem Solving</w:t>
+        <w:t>NPTEL — Data Structures and Algorithms Using Python  ·  HackerRank — Problem Solving</w:t>
       </w:r>
     </w:p>
     <w:sectPr>
       <w:pgSz w:w="12240" w:h="15840"/>
-      <w:pgMar w:top="1440" w:right="1800" w:bottom="1440" w:left="1800" w:header="720" w:footer="720" w:gutter="0"/>
+      <w:pgMar w:top="691" w:right="835" w:bottom="691" w:left="835" w:header="720" w:footer="720" w:gutter="0"/>
       <w:cols w:space="720"/>
       <w:docGrid w:linePitch="360"/>
     </w:sectPr>
@@ -639,6 +938,13 @@
     <w:name w:val="Normal"/>
     <w:qFormat/>
     <w:rsid w:val="00FC693F"/>
+    <w:pPr>
+      <w:spacing w:after="50" w:line="250" w:lineRule="auto"/>
+    </w:pPr>
+    <w:rPr>
+      <w:rFonts w:ascii="Aptos" w:hAnsi="Aptos"/>
+      <w:sz w:val="18"/>
+    </w:rPr>
   </w:style>
   <w:style w:type="paragraph" w:styleId="Header">
     <w:name w:val="header"/>
@@ -699,7 +1005,7 @@
       <w:outlineLvl w:val="0"/>
     </w:pPr>
     <w:rPr>
-      <w:rFonts w:asciiTheme="majorHAnsi" w:eastAsiaTheme="majorEastAsia" w:hAnsiTheme="majorHAnsi" w:cstheme="majorBidi"/>
+      <w:rFonts w:asciiTheme="majorHAnsi" w:eastAsiaTheme="majorEastAsia" w:hAnsiTheme="majorHAnsi" w:cstheme="majorBidi" w:ascii="Aptos Display" w:hAnsi="Aptos Display"/>
       <w:b/>
       <w:bCs/>
       <w:color w:val="365F91" w:themeColor="accent1" w:themeShade="BF"/>
@@ -723,7 +1029,7 @@
       <w:outlineLvl w:val="1"/>
     </w:pPr>
     <w:rPr>
-      <w:rFonts w:asciiTheme="majorHAnsi" w:eastAsiaTheme="majorEastAsia" w:hAnsiTheme="majorHAnsi" w:cstheme="majorBidi"/>
+      <w:rFonts w:asciiTheme="majorHAnsi" w:eastAsiaTheme="majorEastAsia" w:hAnsiTheme="majorHAnsi" w:cstheme="majorBidi" w:ascii="Aptos Display" w:hAnsi="Aptos Display"/>
       <w:b/>
       <w:bCs/>
       <w:color w:val="4F81BD" w:themeColor="accent1"/>
@@ -988,7 +1294,7 @@
       <w:contextualSpacing/>
     </w:pPr>
     <w:rPr>
-      <w:rFonts w:asciiTheme="majorHAnsi" w:eastAsiaTheme="majorEastAsia" w:hAnsiTheme="majorHAnsi" w:cstheme="majorBidi"/>
+      <w:rFonts w:asciiTheme="majorHAnsi" w:eastAsiaTheme="majorEastAsia" w:hAnsiTheme="majorHAnsi" w:cstheme="majorBidi" w:ascii="Aptos Display" w:hAnsi="Aptos Display"/>
       <w:color w:val="17365D" w:themeColor="text2" w:themeShade="BF"/>
       <w:spacing w:val="5"/>
       <w:kern w:val="28"/>

</xml_diff>